<commit_message>
added interviewee B consent form
</commit_message>
<xml_diff>
--- a/Consent Forms/participant-consent-form-(interviewee B).docx
+++ b/Consent Forms/participant-consent-form-(interviewee B).docx
@@ -243,16 +243,13 @@
           <w:placeholder>
             <w:docPart w:val="4291926EB2F74A9184E970A4A3AEE304"/>
           </w:placeholder>
-          <w:showingPlcHdr/>
         </w:sdtPr>
         <w:sdtContent>
           <w:r>
             <w:rPr>
-              <w:rStyle w:val="PlaceholderText"/>
               <w:rFonts w:cs="Arial"/>
-              <w:color w:val="A6A6A6" w:themeColor="background1" w:themeShade="A6"/>
             </w:rPr>
-            <w:t>Chief investigator name (incl. title)</w:t>
+            <w:t>Christina Liu</w:t>
           </w:r>
         </w:sdtContent>
       </w:sdt>
@@ -280,7 +277,6 @@
         <w:placeholder>
           <w:docPart w:val="2DA293ED7377427D8D8E3C99A5AB575A"/>
         </w:placeholder>
-        <w:showingPlcHdr/>
       </w:sdtPr>
       <w:sdtContent>
         <w:p>
@@ -292,11 +288,9 @@
           </w:pPr>
           <w:r>
             <w:rPr>
-              <w:rStyle w:val="PlaceholderText"/>
               <w:rFonts w:cs="Arial"/>
-              <w:color w:val="A6A6A6" w:themeColor="background1" w:themeShade="A6"/>
             </w:rPr>
-            <w:t>Department/School/Faculty</w:t>
+            <w:t>Faculty of Engineering</w:t>
           </w:r>
         </w:p>
       </w:sdtContent>
@@ -331,16 +325,13 @@
           <w:placeholder>
             <w:docPart w:val="6B79B8C218CA4B96AEF4C49C1B9D29EA"/>
           </w:placeholder>
-          <w:showingPlcHdr/>
         </w:sdtPr>
         <w:sdtContent>
           <w:r>
             <w:rPr>
-              <w:rStyle w:val="PlaceholderText"/>
               <w:rFonts w:cs="Arial"/>
-              <w:color w:val="A6A6A6" w:themeColor="background1" w:themeShade="A6"/>
             </w:rPr>
-            <w:t>phone number</w:t>
+            <w:t>0402628559</w:t>
           </w:r>
         </w:sdtContent>
       </w:sdt>
@@ -361,23 +352,22 @@
           <w:placeholder>
             <w:docPart w:val="0F9EEA48D2904D40B0BD755F07CD4832"/>
           </w:placeholder>
-          <w:showingPlcHdr/>
         </w:sdtPr>
         <w:sdtContent>
           <w:r>
             <w:rPr>
-              <w:rStyle w:val="PlaceholderText"/>
               <w:rFonts w:cs="Arial"/>
-              <w:color w:val="A6A6A6" w:themeColor="background1" w:themeShade="A6"/>
             </w:rPr>
-            <w:t>email</w:t>
+            <w:t>cliu0081@uni.sydney.edu.au</w:t>
           </w:r>
         </w:sdtContent>
       </w:sdt>
     </w:p>
+    <w:bookmarkEnd w:id="0"/>
     <w:p>
       <w:pPr>
         <w:spacing w:after="0"/>
+        <w:jc w:val="both"/>
         <w:rPr>
           <w:rFonts w:cs="Arial"/>
         </w:rPr>
@@ -387,23 +377,283 @@
           <w:rPr>
             <w:rFonts w:cs="Arial"/>
           </w:rPr>
-          <w:alias w:val="Student name"/>
-          <w:tag w:val="Student name"/>
+          <w:alias w:val="Student researcher"/>
+          <w:tag w:val="Student researcher"/>
           <w:id w:val="-1886019707"/>
           <w:placeholder>
-            <w:docPart w:val="993A65BFC0424CC4936968E44259B7CD"/>
+            <w:docPart w:val="87FD619E0F22F2429736D8FA1B67C542"/>
           </w:placeholder>
-          <w:showingPlcHdr/>
         </w:sdtPr>
         <w:sdtContent>
+          <w:proofErr w:type="spellStart"/>
           <w:r>
             <w:rPr>
-              <w:rStyle w:val="PlaceholderText"/>
+              <w:kern w:val="2"/>
+              <w:lang w:val="en-US"/>
+              <w14:textOutline w14:w="12700" w14:cap="flat" w14:cmpd="sng" w14:algn="ctr">
+                <w14:noFill/>
+                <w14:prstDash w14:val="solid"/>
+                <w14:miter w14:lim="400000"/>
+              </w14:textOutline>
+            </w:rPr>
+            <w:t>Seonghyun</w:t>
+          </w:r>
+          <w:proofErr w:type="spellEnd"/>
+          <w:r>
+            <w:rPr>
+              <w:kern w:val="2"/>
+              <w:lang w:val="en-US"/>
+              <w14:textOutline w14:w="12700" w14:cap="flat" w14:cmpd="sng" w14:algn="ctr">
+                <w14:noFill/>
+                <w14:prstDash w14:val="solid"/>
+                <w14:miter w14:lim="400000"/>
+              </w14:textOutline>
+            </w:rPr>
+            <w:t xml:space="preserve"> Kim </w:t>
+          </w:r>
+          <w:r>
+            <w:rPr>
               <w:rFonts w:cs="Arial"/>
-              <w:color w:val="A6A6A6" w:themeColor="background1" w:themeShade="A6"/>
             </w:rPr>
-            <w:t>Student researcher name</w:t>
+            <w:t>(</w:t>
           </w:r>
+          <w:sdt>
+            <w:sdtPr>
+              <w:rPr>
+                <w:rFonts w:cs="Arial"/>
+              </w:rPr>
+              <w:alias w:val="Degree"/>
+              <w:tag w:val="Degree"/>
+              <w:id w:val="578639237"/>
+              <w:placeholder>
+                <w:docPart w:val="7FA4AADFA0EEF947AC7AEA65E253CAA8"/>
+              </w:placeholder>
+            </w:sdtPr>
+            <w:sdtContent>
+              <w:r>
+                <w:rPr>
+                  <w:rFonts w:cs="Arial"/>
+                </w:rPr>
+                <w:t>Advanced Computing</w:t>
+              </w:r>
+            </w:sdtContent>
+          </w:sdt>
+          <w:r>
+            <w:rPr>
+              <w:rFonts w:cs="Arial"/>
+            </w:rPr>
+            <w:t xml:space="preserve"> student) | Email: </w:t>
+          </w:r>
+          <w:sdt>
+            <w:sdtPr>
+              <w:rPr>
+                <w:rFonts w:cs="Arial"/>
+              </w:rPr>
+              <w:alias w:val="Student email"/>
+              <w:tag w:val="Student email"/>
+              <w:id w:val="-1406759495"/>
+              <w:placeholder>
+                <w:docPart w:val="AD452EA38145784F9457B6B6103AA797"/>
+              </w:placeholder>
+            </w:sdtPr>
+            <w:sdtContent>
+              <w:r>
+                <w:rPr>
+                  <w:rFonts w:cs="Arial"/>
+                  <w:color w:val="0C1014"/>
+                  <w:sz w:val="23"/>
+                  <w:szCs w:val="23"/>
+                  <w:shd w:val="clear" w:color="auto" w:fill="F3F5F7"/>
+                </w:rPr>
+                <w:t>skim0527@uni.sydney.edu.au</w:t>
+              </w:r>
+            </w:sdtContent>
+          </w:sdt>
+          <w:r>
+            <w:rPr>
+              <w:kern w:val="2"/>
+              <w:lang w:val="en-US"/>
+              <w14:textOutline w14:w="12700" w14:cap="flat" w14:cmpd="sng" w14:algn="ctr">
+                <w14:noFill/>
+                <w14:prstDash w14:val="solid"/>
+                <w14:miter w14:lim="400000"/>
+              </w14:textOutline>
+            </w:rPr>
+            <w:t xml:space="preserve">, </w:t>
+          </w:r>
+          <w:r>
+            <w:rPr>
+              <w:lang w:val="en-US"/>
+            </w:rPr>
+            <w:t xml:space="preserve">Adam Li </w:t>
+          </w:r>
+          <w:r>
+            <w:rPr>
+              <w:rFonts w:cs="Arial"/>
+            </w:rPr>
+            <w:t>(</w:t>
+          </w:r>
+          <w:sdt>
+            <w:sdtPr>
+              <w:rPr>
+                <w:rFonts w:cs="Arial"/>
+              </w:rPr>
+              <w:alias w:val="Degree"/>
+              <w:tag w:val="Degree"/>
+              <w:id w:val="-1009986739"/>
+              <w:placeholder>
+                <w:docPart w:val="882CD21046E29141A5C65C9D6F18C113"/>
+              </w:placeholder>
+            </w:sdtPr>
+            <w:sdtContent>
+              <w:sdt>
+                <w:sdtPr>
+                  <w:rPr>
+                    <w:rFonts w:cs="Arial"/>
+                  </w:rPr>
+                  <w:alias w:val="Degree"/>
+                  <w:tag w:val="Degree"/>
+                  <w:id w:val="-198621784"/>
+                  <w:placeholder>
+                    <w:docPart w:val="85067342701E514792BE8D410D119C5E"/>
+                  </w:placeholder>
+                </w:sdtPr>
+                <w:sdtContent>
+                  <w:r>
+                    <w:rPr>
+                      <w:rFonts w:cs="Arial"/>
+                    </w:rPr>
+                    <w:t>Advanced Computing</w:t>
+                  </w:r>
+                </w:sdtContent>
+              </w:sdt>
+            </w:sdtContent>
+          </w:sdt>
+          <w:r>
+            <w:rPr>
+              <w:rFonts w:cs="Arial"/>
+            </w:rPr>
+            <w:t xml:space="preserve"> student) | Email: </w:t>
+          </w:r>
+          <w:sdt>
+            <w:sdtPr>
+              <w:rPr>
+                <w:rFonts w:cs="Arial"/>
+              </w:rPr>
+              <w:alias w:val="Student email"/>
+              <w:tag w:val="Student email"/>
+              <w:id w:val="-1804305815"/>
+              <w:placeholder>
+                <w:docPart w:val="6B61BCE64193504EA50F797349380F01"/>
+              </w:placeholder>
+            </w:sdtPr>
+            <w:sdtContent>
+              <w:r>
+                <w:rPr>
+                  <w:rFonts w:cs="Arial"/>
+                  <w:color w:val="0C1014"/>
+                  <w:sz w:val="23"/>
+                  <w:szCs w:val="23"/>
+                  <w:shd w:val="clear" w:color="auto" w:fill="F3F5F7"/>
+                </w:rPr>
+                <w:t>zhli0710@</w:t>
+              </w:r>
+              <w:r>
+                <w:rPr>
+                  <w:rFonts w:cs="Arial"/>
+                  <w:color w:val="0C1014"/>
+                  <w:sz w:val="23"/>
+                  <w:szCs w:val="23"/>
+                  <w:shd w:val="clear" w:color="auto" w:fill="F3F5F7"/>
+                </w:rPr>
+                <w:t xml:space="preserve"> </w:t>
+              </w:r>
+              <w:r>
+                <w:rPr>
+                  <w:rFonts w:cs="Arial"/>
+                  <w:color w:val="0C1014"/>
+                  <w:sz w:val="23"/>
+                  <w:szCs w:val="23"/>
+                  <w:shd w:val="clear" w:color="auto" w:fill="F3F5F7"/>
+                </w:rPr>
+                <w:t>uni.sydney.edu.au</w:t>
+              </w:r>
+            </w:sdtContent>
+          </w:sdt>
+          <w:r>
+            <w:rPr>
+              <w:lang w:val="en-US"/>
+            </w:rPr>
+            <w:t xml:space="preserve">, Jimu Li </w:t>
+          </w:r>
+          <w:r>
+            <w:rPr>
+              <w:rFonts w:cs="Arial"/>
+            </w:rPr>
+            <w:t>(</w:t>
+          </w:r>
+          <w:sdt>
+            <w:sdtPr>
+              <w:rPr>
+                <w:rFonts w:cs="Arial"/>
+              </w:rPr>
+              <w:alias w:val="Degree"/>
+              <w:tag w:val="Degree"/>
+              <w:id w:val="-722683395"/>
+              <w:placeholder>
+                <w:docPart w:val="469413DAE7054144B6B3A6C86BC7B7B6"/>
+              </w:placeholder>
+            </w:sdtPr>
+            <w:sdtContent>
+              <w:r>
+                <w:rPr>
+                  <w:rFonts w:cs="Arial"/>
+                </w:rPr>
+                <w:t>Advanced Computing and Medical Science</w:t>
+              </w:r>
+            </w:sdtContent>
+          </w:sdt>
+          <w:r>
+            <w:rPr>
+              <w:rFonts w:cs="Arial"/>
+            </w:rPr>
+            <w:t xml:space="preserve"> student) | Email: </w:t>
+          </w:r>
+          <w:sdt>
+            <w:sdtPr>
+              <w:rPr>
+                <w:rFonts w:cs="Arial"/>
+              </w:rPr>
+              <w:alias w:val="Student email"/>
+              <w:tag w:val="Student email"/>
+              <w:id w:val="-2065783246"/>
+              <w:placeholder>
+                <w:docPart w:val="3EBDFA48CF8A2642BDF446DA9C63BFC2"/>
+              </w:placeholder>
+            </w:sdtPr>
+            <w:sdtContent>
+              <w:r>
+                <w:rPr>
+                  <w:rFonts w:cs="Arial"/>
+                  <w:color w:val="0C1014"/>
+                  <w:sz w:val="23"/>
+                  <w:szCs w:val="23"/>
+                  <w:shd w:val="clear" w:color="auto" w:fill="F3F5F7"/>
+                </w:rPr>
+                <w:t>jili0060</w:t>
+              </w:r>
+              <w:r>
+                <w:rPr>
+                  <w:rFonts w:cs="Arial"/>
+                  <w:color w:val="0C1014"/>
+                  <w:sz w:val="23"/>
+                  <w:szCs w:val="23"/>
+                  <w:shd w:val="clear" w:color="auto" w:fill="F3F5F7"/>
+                </w:rPr>
+                <w:t>@uni.sydney.edu.au</w:t>
+              </w:r>
+            </w:sdtContent>
+          </w:sdt>
         </w:sdtContent>
       </w:sdt>
       <w:r>
@@ -412,68 +662,7 @@
         </w:rPr>
         <w:t xml:space="preserve"> </w:t>
       </w:r>
-      <w:r>
-        <w:rPr>
-          <w:rFonts w:cs="Arial"/>
-        </w:rPr>
-        <w:t>(</w:t>
-      </w:r>
-      <w:sdt>
-        <w:sdtPr>
-          <w:rPr>
-            <w:rFonts w:cs="Arial"/>
-          </w:rPr>
-          <w:alias w:val="Degree"/>
-          <w:tag w:val="Degree"/>
-          <w:id w:val="578639237"/>
-          <w:placeholder>
-            <w:docPart w:val="551B6B5679E84E9E8F65F8C923AABB1D"/>
-          </w:placeholder>
-          <w:showingPlcHdr/>
-        </w:sdtPr>
-        <w:sdtContent>
-          <w:r>
-            <w:rPr>
-              <w:rStyle w:val="PlaceholderText"/>
-              <w:rFonts w:cs="Arial"/>
-              <w:color w:val="A6A6A6" w:themeColor="background1" w:themeShade="A6"/>
-            </w:rPr>
-            <w:t>Degree</w:t>
-          </w:r>
-        </w:sdtContent>
-      </w:sdt>
-      <w:r>
-        <w:rPr>
-          <w:rFonts w:cs="Arial"/>
-        </w:rPr>
-        <w:t xml:space="preserve"> Student) | Email: </w:t>
-      </w:r>
-      <w:sdt>
-        <w:sdtPr>
-          <w:rPr>
-            <w:rFonts w:cs="Arial"/>
-          </w:rPr>
-          <w:alias w:val="Student email"/>
-          <w:tag w:val="Student email"/>
-          <w:id w:val="-1406759495"/>
-          <w:placeholder>
-            <w:docPart w:val="023E8B43ABE345A6A5C338EE1F242DBF"/>
-          </w:placeholder>
-          <w:showingPlcHdr/>
-        </w:sdtPr>
-        <w:sdtContent>
-          <w:r>
-            <w:rPr>
-              <w:rStyle w:val="PlaceholderText"/>
-              <w:rFonts w:cs="Arial"/>
-              <w:color w:val="A6A6A6" w:themeColor="background1" w:themeShade="A6"/>
-            </w:rPr>
-            <w:t>email</w:t>
-          </w:r>
-        </w:sdtContent>
-      </w:sdt>
     </w:p>
-    <w:bookmarkEnd w:id="0"/>
     <w:p>
       <w:pPr>
         <w:spacing w:after="0" w:line="240" w:lineRule="auto"/>
@@ -975,57 +1164,14 @@
         <w:rPr>
           <w:rFonts w:cs="Arial"/>
         </w:rPr>
-        <w:t xml:space="preserve"> </w:t>
-      </w:r>
-      <w:sdt>
-        <w:sdtPr>
-          <w:rPr>
-            <w:rFonts w:cs="Arial"/>
-          </w:rPr>
-          <w:alias w:val="Other parties"/>
-          <w:tag w:val="Other parties"/>
-          <w:id w:val="-1455319707"/>
-          <w:placeholder>
-            <w:docPart w:val="4764FFC2382C49679D5BAD7AA0C9A973"/>
-          </w:placeholder>
-          <w:showingPlcHdr/>
-          <w:text/>
-        </w:sdtPr>
-        <w:sdtContent>
-          <w:r>
-            <w:rPr>
-              <w:rStyle w:val="PlaceholderText"/>
-              <w:rFonts w:cs="Arial"/>
-              <w:color w:val="A6A6A6" w:themeColor="background1" w:themeShade="A6"/>
-            </w:rPr>
-            <w:t xml:space="preserve">insert any other party </w:t>
-          </w:r>
-          <w:r>
-            <w:rPr>
-              <w:rStyle w:val="PlaceholderText"/>
-              <w:rFonts w:cs="Arial"/>
-              <w:color w:val="A6A6A6" w:themeColor="background1" w:themeShade="A6"/>
-            </w:rPr>
-            <w:t>to which this assurance is relevant and true</w:t>
-          </w:r>
-        </w:sdtContent>
-      </w:sdt>
-      <w:r>
-        <w:rPr>
-          <w:rFonts w:cs="Arial"/>
-        </w:rPr>
         <w:t>.</w:t>
-      </w:r>
-      <w:r>
-        <w:rPr>
-          <w:rFonts w:cs="Arial"/>
-        </w:rPr>
-        <w:t xml:space="preserve"> </w:t>
       </w:r>
     </w:p>
     <w:p>
       <w:pPr>
-        <w:pStyle w:val="NoSpacing"/>
+        <w:spacing w:after="0" w:line="240" w:lineRule="auto"/>
+        <w:contextualSpacing/>
+        <w:jc w:val="both"/>
         <w:rPr>
           <w:rFonts w:cs="Arial"/>
         </w:rPr>
@@ -7260,99 +7406,6 @@
     </w:docPart>
     <w:docPart>
       <w:docPartPr>
-        <w:name w:val="993A65BFC0424CC4936968E44259B7CD"/>
-        <w:category>
-          <w:name w:val="General"/>
-          <w:gallery w:val="placeholder"/>
-        </w:category>
-        <w:types>
-          <w:type w:val="bbPlcHdr"/>
-        </w:types>
-        <w:behaviors>
-          <w:behavior w:val="content"/>
-        </w:behaviors>
-        <w:guid w:val="{DDFE74F5-5056-403B-87FA-B323548FDC2D}"/>
-      </w:docPartPr>
-      <w:docPartBody>
-        <w:p>
-          <w:pPr>
-            <w:pStyle w:val="993A65BFC0424CC4936968E44259B7CD2"/>
-          </w:pPr>
-          <w:r>
-            <w:rPr>
-              <w:rStyle w:val="PlaceholderText"/>
-              <w:rFonts w:ascii="Arial" w:hAnsi="Arial" w:cs="Arial"/>
-              <w:color w:val="A6A6A6" w:themeColor="background1" w:themeShade="A6"/>
-            </w:rPr>
-            <w:t>Student researcher name</w:t>
-          </w:r>
-        </w:p>
-      </w:docPartBody>
-    </w:docPart>
-    <w:docPart>
-      <w:docPartPr>
-        <w:name w:val="551B6B5679E84E9E8F65F8C923AABB1D"/>
-        <w:category>
-          <w:name w:val="General"/>
-          <w:gallery w:val="placeholder"/>
-        </w:category>
-        <w:types>
-          <w:type w:val="bbPlcHdr"/>
-        </w:types>
-        <w:behaviors>
-          <w:behavior w:val="content"/>
-        </w:behaviors>
-        <w:guid w:val="{0E7280A9-4509-40EB-B633-98CC5AE1DF02}"/>
-      </w:docPartPr>
-      <w:docPartBody>
-        <w:p>
-          <w:pPr>
-            <w:pStyle w:val="551B6B5679E84E9E8F65F8C923AABB1D2"/>
-          </w:pPr>
-          <w:r>
-            <w:rPr>
-              <w:rStyle w:val="PlaceholderText"/>
-              <w:rFonts w:ascii="Arial" w:hAnsi="Arial" w:cs="Arial"/>
-              <w:color w:val="A6A6A6" w:themeColor="background1" w:themeShade="A6"/>
-            </w:rPr>
-            <w:t>Degree</w:t>
-          </w:r>
-        </w:p>
-      </w:docPartBody>
-    </w:docPart>
-    <w:docPart>
-      <w:docPartPr>
-        <w:name w:val="023E8B43ABE345A6A5C338EE1F242DBF"/>
-        <w:category>
-          <w:name w:val="General"/>
-          <w:gallery w:val="placeholder"/>
-        </w:category>
-        <w:types>
-          <w:type w:val="bbPlcHdr"/>
-        </w:types>
-        <w:behaviors>
-          <w:behavior w:val="content"/>
-        </w:behaviors>
-        <w:guid w:val="{BCB13764-400F-40AB-A2DF-31D9EC1AF7DF}"/>
-      </w:docPartPr>
-      <w:docPartBody>
-        <w:p>
-          <w:pPr>
-            <w:pStyle w:val="023E8B43ABE345A6A5C338EE1F242DBF2"/>
-          </w:pPr>
-          <w:r>
-            <w:rPr>
-              <w:rStyle w:val="PlaceholderText"/>
-              <w:rFonts w:ascii="Arial" w:hAnsi="Arial" w:cs="Arial"/>
-              <w:color w:val="A6A6A6" w:themeColor="background1" w:themeShade="A6"/>
-            </w:rPr>
-            <w:t>email</w:t>
-          </w:r>
-        </w:p>
-      </w:docPartBody>
-    </w:docPart>
-    <w:docPart>
-      <w:docPartPr>
         <w:name w:val="0F9EEA48D2904D40B0BD755F07CD4832"/>
         <w:category>
           <w:name w:val="General"/>
@@ -7485,37 +7538,6 @@
     </w:docPart>
     <w:docPart>
       <w:docPartPr>
-        <w:name w:val="4764FFC2382C49679D5BAD7AA0C9A973"/>
-        <w:category>
-          <w:name w:val="General"/>
-          <w:gallery w:val="placeholder"/>
-        </w:category>
-        <w:types>
-          <w:type w:val="bbPlcHdr"/>
-        </w:types>
-        <w:behaviors>
-          <w:behavior w:val="content"/>
-        </w:behaviors>
-        <w:guid w:val="{F7391A89-B26B-4FE6-8142-BE42457A252A}"/>
-      </w:docPartPr>
-      <w:docPartBody>
-        <w:p>
-          <w:pPr>
-            <w:pStyle w:val="4764FFC2382C49679D5BAD7AA0C9A9732"/>
-          </w:pPr>
-          <w:r>
-            <w:rPr>
-              <w:rStyle w:val="PlaceholderText"/>
-              <w:rFonts w:ascii="Arial" w:hAnsi="Arial" w:cs="Arial"/>
-              <w:color w:val="A6A6A6" w:themeColor="background1" w:themeShade="A6"/>
-            </w:rPr>
-            <w:t>insert any other party to which this assurance is relevant and true</w:t>
-          </w:r>
-        </w:p>
-      </w:docPartBody>
-    </w:docPart>
-    <w:docPart>
-      <w:docPartPr>
         <w:name w:val="0C7D4BDECE484EB3820C01CF66446FB1"/>
         <w:category>
           <w:name w:val="General"/>
@@ -7603,6 +7625,254 @@
               <w:color w:val="A6A6A6" w:themeColor="background1" w:themeShade="A6"/>
             </w:rPr>
             <w:t>indicate specific recordings or requirements e.g., audio and/or video-recordings, photographs, eye tracking, location tracking, access to existing records. If not relevant remove paragraph</w:t>
+          </w:r>
+        </w:p>
+      </w:docPartBody>
+    </w:docPart>
+    <w:docPart>
+      <w:docPartPr>
+        <w:name w:val="87FD619E0F22F2429736D8FA1B67C542"/>
+        <w:category>
+          <w:name w:val="General"/>
+          <w:gallery w:val="placeholder"/>
+        </w:category>
+        <w:types>
+          <w:type w:val="bbPlcHdr"/>
+        </w:types>
+        <w:behaviors>
+          <w:behavior w:val="content"/>
+        </w:behaviors>
+        <w:guid w:val="{2E374519-8736-5A46-B0CE-5905725DE01B}"/>
+      </w:docPartPr>
+      <w:docPartBody>
+        <w:p>
+          <w:pPr>
+            <w:pStyle w:val="87FD619E0F22F2429736D8FA1B67C542"/>
+          </w:pPr>
+          <w:r>
+            <w:rPr>
+              <w:rStyle w:val="PlaceholderText"/>
+              <w:rFonts w:ascii="Arial" w:hAnsi="Arial" w:cs="Arial"/>
+              <w:color w:val="A6A6A6" w:themeColor="background1" w:themeShade="A6"/>
+            </w:rPr>
+            <w:t>Student researcher name</w:t>
+          </w:r>
+        </w:p>
+      </w:docPartBody>
+    </w:docPart>
+    <w:docPart>
+      <w:docPartPr>
+        <w:name w:val="7FA4AADFA0EEF947AC7AEA65E253CAA8"/>
+        <w:category>
+          <w:name w:val="General"/>
+          <w:gallery w:val="placeholder"/>
+        </w:category>
+        <w:types>
+          <w:type w:val="bbPlcHdr"/>
+        </w:types>
+        <w:behaviors>
+          <w:behavior w:val="content"/>
+        </w:behaviors>
+        <w:guid w:val="{E2CB73B2-639D-DD4D-9696-77F7AA9E1908}"/>
+      </w:docPartPr>
+      <w:docPartBody>
+        <w:p>
+          <w:pPr>
+            <w:pStyle w:val="7FA4AADFA0EEF947AC7AEA65E253CAA8"/>
+          </w:pPr>
+          <w:r>
+            <w:rPr>
+              <w:rStyle w:val="PlaceholderText"/>
+              <w:rFonts w:ascii="Arial" w:hAnsi="Arial" w:cs="Arial"/>
+              <w:color w:val="A6A6A6" w:themeColor="background1" w:themeShade="A6"/>
+            </w:rPr>
+            <w:t>Degree</w:t>
+          </w:r>
+        </w:p>
+      </w:docPartBody>
+    </w:docPart>
+    <w:docPart>
+      <w:docPartPr>
+        <w:name w:val="AD452EA38145784F9457B6B6103AA797"/>
+        <w:category>
+          <w:name w:val="General"/>
+          <w:gallery w:val="placeholder"/>
+        </w:category>
+        <w:types>
+          <w:type w:val="bbPlcHdr"/>
+        </w:types>
+        <w:behaviors>
+          <w:behavior w:val="content"/>
+        </w:behaviors>
+        <w:guid w:val="{C7935901-444F-2B43-B736-9D3CE49D856A}"/>
+      </w:docPartPr>
+      <w:docPartBody>
+        <w:p>
+          <w:pPr>
+            <w:pStyle w:val="AD452EA38145784F9457B6B6103AA797"/>
+          </w:pPr>
+          <w:r>
+            <w:rPr>
+              <w:rStyle w:val="PlaceholderText"/>
+              <w:rFonts w:ascii="Arial" w:hAnsi="Arial" w:cs="Arial"/>
+              <w:color w:val="A6A6A6" w:themeColor="background1" w:themeShade="A6"/>
+            </w:rPr>
+            <w:t>email</w:t>
+          </w:r>
+        </w:p>
+      </w:docPartBody>
+    </w:docPart>
+    <w:docPart>
+      <w:docPartPr>
+        <w:name w:val="882CD21046E29141A5C65C9D6F18C113"/>
+        <w:category>
+          <w:name w:val="General"/>
+          <w:gallery w:val="placeholder"/>
+        </w:category>
+        <w:types>
+          <w:type w:val="bbPlcHdr"/>
+        </w:types>
+        <w:behaviors>
+          <w:behavior w:val="content"/>
+        </w:behaviors>
+        <w:guid w:val="{52919A7D-D1FE-5E41-A03E-4E4FD2815F1F}"/>
+      </w:docPartPr>
+      <w:docPartBody>
+        <w:p>
+          <w:pPr>
+            <w:pStyle w:val="882CD21046E29141A5C65C9D6F18C113"/>
+          </w:pPr>
+          <w:r>
+            <w:rPr>
+              <w:rStyle w:val="PlaceholderText"/>
+              <w:rFonts w:ascii="Arial" w:hAnsi="Arial" w:cs="Arial"/>
+              <w:color w:val="A6A6A6" w:themeColor="background1" w:themeShade="A6"/>
+            </w:rPr>
+            <w:t>Degree</w:t>
+          </w:r>
+        </w:p>
+      </w:docPartBody>
+    </w:docPart>
+    <w:docPart>
+      <w:docPartPr>
+        <w:name w:val="85067342701E514792BE8D410D119C5E"/>
+        <w:category>
+          <w:name w:val="General"/>
+          <w:gallery w:val="placeholder"/>
+        </w:category>
+        <w:types>
+          <w:type w:val="bbPlcHdr"/>
+        </w:types>
+        <w:behaviors>
+          <w:behavior w:val="content"/>
+        </w:behaviors>
+        <w:guid w:val="{C1F9F18E-8DF0-B543-B665-6DCD8CEDF4BA}"/>
+      </w:docPartPr>
+      <w:docPartBody>
+        <w:p>
+          <w:pPr>
+            <w:pStyle w:val="85067342701E514792BE8D410D119C5E"/>
+          </w:pPr>
+          <w:r>
+            <w:rPr>
+              <w:rStyle w:val="PlaceholderText"/>
+              <w:rFonts w:ascii="Arial" w:hAnsi="Arial" w:cs="Arial"/>
+              <w:color w:val="A6A6A6" w:themeColor="background1" w:themeShade="A6"/>
+            </w:rPr>
+            <w:t>Degree</w:t>
+          </w:r>
+        </w:p>
+      </w:docPartBody>
+    </w:docPart>
+    <w:docPart>
+      <w:docPartPr>
+        <w:name w:val="6B61BCE64193504EA50F797349380F01"/>
+        <w:category>
+          <w:name w:val="General"/>
+          <w:gallery w:val="placeholder"/>
+        </w:category>
+        <w:types>
+          <w:type w:val="bbPlcHdr"/>
+        </w:types>
+        <w:behaviors>
+          <w:behavior w:val="content"/>
+        </w:behaviors>
+        <w:guid w:val="{E47EBBE1-83A7-9B4A-8B46-B98167562539}"/>
+      </w:docPartPr>
+      <w:docPartBody>
+        <w:p>
+          <w:pPr>
+            <w:pStyle w:val="6B61BCE64193504EA50F797349380F01"/>
+          </w:pPr>
+          <w:r>
+            <w:rPr>
+              <w:rStyle w:val="PlaceholderText"/>
+              <w:rFonts w:ascii="Arial" w:hAnsi="Arial" w:cs="Arial"/>
+              <w:color w:val="A6A6A6" w:themeColor="background1" w:themeShade="A6"/>
+            </w:rPr>
+            <w:t>email</w:t>
+          </w:r>
+        </w:p>
+      </w:docPartBody>
+    </w:docPart>
+    <w:docPart>
+      <w:docPartPr>
+        <w:name w:val="469413DAE7054144B6B3A6C86BC7B7B6"/>
+        <w:category>
+          <w:name w:val="General"/>
+          <w:gallery w:val="placeholder"/>
+        </w:category>
+        <w:types>
+          <w:type w:val="bbPlcHdr"/>
+        </w:types>
+        <w:behaviors>
+          <w:behavior w:val="content"/>
+        </w:behaviors>
+        <w:guid w:val="{BAC8D61E-E461-A448-B42D-72966D49DA90}"/>
+      </w:docPartPr>
+      <w:docPartBody>
+        <w:p>
+          <w:pPr>
+            <w:pStyle w:val="469413DAE7054144B6B3A6C86BC7B7B6"/>
+          </w:pPr>
+          <w:r>
+            <w:rPr>
+              <w:rStyle w:val="PlaceholderText"/>
+              <w:rFonts w:ascii="Arial" w:hAnsi="Arial" w:cs="Arial"/>
+              <w:color w:val="A6A6A6" w:themeColor="background1" w:themeShade="A6"/>
+            </w:rPr>
+            <w:t>Degree</w:t>
+          </w:r>
+        </w:p>
+      </w:docPartBody>
+    </w:docPart>
+    <w:docPart>
+      <w:docPartPr>
+        <w:name w:val="3EBDFA48CF8A2642BDF446DA9C63BFC2"/>
+        <w:category>
+          <w:name w:val="General"/>
+          <w:gallery w:val="placeholder"/>
+        </w:category>
+        <w:types>
+          <w:type w:val="bbPlcHdr"/>
+        </w:types>
+        <w:behaviors>
+          <w:behavior w:val="content"/>
+        </w:behaviors>
+        <w:guid w:val="{52B5F758-1A49-7743-919F-B56436E76EC6}"/>
+      </w:docPartPr>
+      <w:docPartBody>
+        <w:p>
+          <w:pPr>
+            <w:pStyle w:val="3EBDFA48CF8A2642BDF446DA9C63BFC2"/>
+          </w:pPr>
+          <w:r>
+            <w:rPr>
+              <w:rStyle w:val="PlaceholderText"/>
+              <w:rFonts w:ascii="Arial" w:hAnsi="Arial" w:cs="Arial"/>
+              <w:color w:val="A6A6A6" w:themeColor="background1" w:themeShade="A6"/>
+            </w:rPr>
+            <w:t>email</w:t>
           </w:r>
         </w:p>
       </w:docPartBody>
@@ -8146,6 +8416,7 @@
     <w:rsid w:val="000B64B2"/>
     <w:rsid w:val="000E4C51"/>
     <w:rsid w:val="001157A9"/>
+    <w:rsid w:val="001C472A"/>
     <w:rsid w:val="001E25D4"/>
     <w:rsid w:val="002A562C"/>
     <w:rsid w:val="002B4BC4"/>
@@ -8157,8 +8428,8 @@
     <w:rsid w:val="0084432E"/>
     <w:rsid w:val="008C0A1E"/>
     <w:rsid w:val="009B0FDC"/>
+    <w:rsid w:val="00A90B3D"/>
     <w:rsid w:val="00B05516"/>
-    <w:rsid w:val="00B132BC"/>
     <w:rsid w:val="00B21564"/>
     <w:rsid w:val="00B62B6E"/>
     <w:rsid w:val="00BC2E96"/>
@@ -8672,7 +8943,7 @@
     <w:basedOn w:val="DefaultParagraphFont"/>
     <w:uiPriority w:val="99"/>
     <w:semiHidden/>
-    <w:rsid w:val="00DE5486"/>
+    <w:rsid w:val="001C472A"/>
     <w:rPr>
       <w:color w:val="808080"/>
     </w:rPr>
@@ -8969,6 +9240,118 @@
     <w:rPr>
       <w:rFonts w:ascii="Source Sans Pro" w:eastAsiaTheme="minorHAnsi" w:hAnsi="Source Sans Pro"/>
       <w:lang w:eastAsia="en-US"/>
+    </w:rPr>
+  </w:style>
+  <w:style w:type="paragraph" w:customStyle="1" w:styleId="87FD619E0F22F2429736D8FA1B67C542">
+    <w:name w:val="87FD619E0F22F2429736D8FA1B67C542"/>
+    <w:rsid w:val="001C472A"/>
+    <w:pPr>
+      <w:spacing w:line="278" w:lineRule="auto"/>
+    </w:pPr>
+    <w:rPr>
+      <w:kern w:val="2"/>
+      <w:sz w:val="24"/>
+      <w:szCs w:val="24"/>
+      <w:lang w:eastAsia="zh-CN"/>
+      <w14:ligatures w14:val="standardContextual"/>
+    </w:rPr>
+  </w:style>
+  <w:style w:type="paragraph" w:customStyle="1" w:styleId="7FA4AADFA0EEF947AC7AEA65E253CAA8">
+    <w:name w:val="7FA4AADFA0EEF947AC7AEA65E253CAA8"/>
+    <w:rsid w:val="001C472A"/>
+    <w:pPr>
+      <w:spacing w:line="278" w:lineRule="auto"/>
+    </w:pPr>
+    <w:rPr>
+      <w:kern w:val="2"/>
+      <w:sz w:val="24"/>
+      <w:szCs w:val="24"/>
+      <w:lang w:eastAsia="zh-CN"/>
+      <w14:ligatures w14:val="standardContextual"/>
+    </w:rPr>
+  </w:style>
+  <w:style w:type="paragraph" w:customStyle="1" w:styleId="AD452EA38145784F9457B6B6103AA797">
+    <w:name w:val="AD452EA38145784F9457B6B6103AA797"/>
+    <w:rsid w:val="001C472A"/>
+    <w:pPr>
+      <w:spacing w:line="278" w:lineRule="auto"/>
+    </w:pPr>
+    <w:rPr>
+      <w:kern w:val="2"/>
+      <w:sz w:val="24"/>
+      <w:szCs w:val="24"/>
+      <w:lang w:eastAsia="zh-CN"/>
+      <w14:ligatures w14:val="standardContextual"/>
+    </w:rPr>
+  </w:style>
+  <w:style w:type="paragraph" w:customStyle="1" w:styleId="882CD21046E29141A5C65C9D6F18C113">
+    <w:name w:val="882CD21046E29141A5C65C9D6F18C113"/>
+    <w:rsid w:val="001C472A"/>
+    <w:pPr>
+      <w:spacing w:line="278" w:lineRule="auto"/>
+    </w:pPr>
+    <w:rPr>
+      <w:kern w:val="2"/>
+      <w:sz w:val="24"/>
+      <w:szCs w:val="24"/>
+      <w:lang w:eastAsia="zh-CN"/>
+      <w14:ligatures w14:val="standardContextual"/>
+    </w:rPr>
+  </w:style>
+  <w:style w:type="paragraph" w:customStyle="1" w:styleId="85067342701E514792BE8D410D119C5E">
+    <w:name w:val="85067342701E514792BE8D410D119C5E"/>
+    <w:rsid w:val="001C472A"/>
+    <w:pPr>
+      <w:spacing w:line="278" w:lineRule="auto"/>
+    </w:pPr>
+    <w:rPr>
+      <w:kern w:val="2"/>
+      <w:sz w:val="24"/>
+      <w:szCs w:val="24"/>
+      <w:lang w:eastAsia="zh-CN"/>
+      <w14:ligatures w14:val="standardContextual"/>
+    </w:rPr>
+  </w:style>
+  <w:style w:type="paragraph" w:customStyle="1" w:styleId="6B61BCE64193504EA50F797349380F01">
+    <w:name w:val="6B61BCE64193504EA50F797349380F01"/>
+    <w:rsid w:val="001C472A"/>
+    <w:pPr>
+      <w:spacing w:line="278" w:lineRule="auto"/>
+    </w:pPr>
+    <w:rPr>
+      <w:kern w:val="2"/>
+      <w:sz w:val="24"/>
+      <w:szCs w:val="24"/>
+      <w:lang w:eastAsia="zh-CN"/>
+      <w14:ligatures w14:val="standardContextual"/>
+    </w:rPr>
+  </w:style>
+  <w:style w:type="paragraph" w:customStyle="1" w:styleId="469413DAE7054144B6B3A6C86BC7B7B6">
+    <w:name w:val="469413DAE7054144B6B3A6C86BC7B7B6"/>
+    <w:rsid w:val="001C472A"/>
+    <w:pPr>
+      <w:spacing w:line="278" w:lineRule="auto"/>
+    </w:pPr>
+    <w:rPr>
+      <w:kern w:val="2"/>
+      <w:sz w:val="24"/>
+      <w:szCs w:val="24"/>
+      <w:lang w:eastAsia="zh-CN"/>
+      <w14:ligatures w14:val="standardContextual"/>
+    </w:rPr>
+  </w:style>
+  <w:style w:type="paragraph" w:customStyle="1" w:styleId="3EBDFA48CF8A2642BDF446DA9C63BFC2">
+    <w:name w:val="3EBDFA48CF8A2642BDF446DA9C63BFC2"/>
+    <w:rsid w:val="001C472A"/>
+    <w:pPr>
+      <w:spacing w:line="278" w:lineRule="auto"/>
+    </w:pPr>
+    <w:rPr>
+      <w:kern w:val="2"/>
+      <w:sz w:val="24"/>
+      <w:szCs w:val="24"/>
+      <w:lang w:eastAsia="zh-CN"/>
+      <w14:ligatures w14:val="standardContextual"/>
     </w:rPr>
   </w:style>
 </w:styles>

</xml_diff>